<commit_message>
Instruções: voz passiva analítica, como na skill de estilo
A P5.5 pedia a passiva sintética e a skill meu-estilo-escrita, a analítica. O
autor escolheu a da skill; a P5.5 e as duas frases do cap. 3 foram ajustadas.

Co-Authored-By: Claude Opus 5.5 <noreply@anthropic.com>
</commit_message>
<xml_diff>
--- a/textos/capitulos/3_metodologia.docx
+++ b/textos/capitulos/3_metodologia.docx
@@ -1870,7 +1870,7 @@
           <w:sz w:val="24"/>
           <w:szCs w:val="24"/>
         </w:rPr>
-        <w:t xml:space="preserve">De cada concorrente, registram-se a avaliação média, o volume de avaliações, o horário de funcionamento (Places API), a política de cobrança, o cardápio, o acervo de jogos e o entorno. Os cardápios têm categorias fixas — bebidas, entradas, pratos principais, sobremesas e couvert ou taxa de jogo — e preço em reais na data da coleta. Item com vários tamanhos ou combos entra nas medianas só pela linha de referência: cardápio mais recente, sem combo, no menor tamanho.</w:t>
+        <w:t xml:space="preserve">De cada concorrente, são registrados a avaliação média, o volume de avaliações, o horário de funcionamento (Places API), a política de cobrança, o cardápio, o acervo de jogos e o entorno. Os cardápios têm categorias fixas — bebidas, entradas, pratos principais, sobremesas e couvert ou taxa de jogo — e preço em reais na data da coleta. Item com vários tamanhos ou combos entra nas medianas só pela linha de referência: cardápio mais recente, sem combo, no menor tamanho.</w:t>
       </w:r>
     </w:p>
     <w:p>
@@ -1900,7 +1900,7 @@
           <w:sz w:val="24"/>
           <w:szCs w:val="24"/>
         </w:rPr>
-        <w:t xml:space="preserve">O entorno é medido no Google Maps. Contam-se as estações de metrô, trem, VLT e BRT e os shoppings de porte num raio de 500 m e de 1.000 m de cada concorrente, e mede-se a distância em linha reta até a estação e o shopping mais próximos. Shopping de porte é o que tem 1.000 avaliações ou mais no Maps; os limiares de 500 e 5.000 avaliações servem de sensibilidade.</w:t>
+        <w:t xml:space="preserve">O entorno é medido no Google Maps. São contados as estações de metrô, trem, VLT e BRT e os shoppings de porte num raio de 500 m e de 1.000 m de cada concorrente, e é medida a distância em linha reta até a estação e o shopping mais próximos. Shopping de porte é o que tem 1.000 avaliações ou mais no Maps; os limiares de 500 e 5.000 avaliações servem de sensibilidade.</w:t>
       </w:r>
     </w:p>
     <w:p>

</xml_diff>